<commit_message>
Added updated cv again
</commit_message>
<xml_diff>
--- a/public/ghs-cv.docx
+++ b/public/ghs-cv.docx
@@ -10,7 +10,8 @@
         <w:ind w:hanging="0" w:start="0"/>
         <w:jc w:val="center"/>
         <w:rPr>
-          <w:rFonts w:ascii="Lato Black" w:hAnsi="Lato Black"/>
+          <w:sz w:val="48"/>
+          <w:szCs w:val="48"/>
         </w:rPr>
       </w:pPr>
       <w:r>
@@ -19,8 +20,8 @@
           <w:b/>
           <w:bCs/>
           <w:color w:val="1F3864"/>
-          <w:sz w:val="44"/>
-          <w:szCs w:val="44"/>
+          <w:sz w:val="48"/>
+          <w:szCs w:val="48"/>
         </w:rPr>
         <w:t>GOBINDO BHOR</w:t>
       </w:r>
@@ -30,8 +31,8 @@
           <w:b/>
           <w:bCs/>
           <w:color w:val="000000"/>
-          <w:sz w:val="44"/>
-          <w:szCs w:val="44"/>
+          <w:sz w:val="48"/>
+          <w:szCs w:val="48"/>
         </w:rPr>
         <w:t xml:space="preserve"> </w:t>
       </w:r>
@@ -78,10 +79,7 @@
         <w:spacing w:lineRule="auto" w:line="326" w:before="0" w:after="15"/>
         <w:ind w:hanging="0" w:start="0"/>
         <w:jc w:val="center"/>
-        <w:rPr>
-          <w:sz w:val="18"/>
-          <w:szCs w:val="18"/>
-        </w:rPr>
+        <w:rPr/>
       </w:pPr>
       <w:r>
         <w:rPr>
@@ -113,14 +111,7 @@
         <w:spacing w:lineRule="auto" w:line="326" w:before="0" w:after="135"/>
         <w:ind w:hanging="0" w:start="0"/>
         <w:jc w:val="center"/>
-        <w:rPr>
-          <w:rFonts w:ascii="Lato Black" w:hAnsi="Lato Black" w:eastAsia="Lato Heavy" w:cs="Lato Heavy"/>
-          <w:b/>
-          <w:bCs/>
-          <w:color w:val="555555"/>
-          <w:sz w:val="20"/>
-          <w:szCs w:val="20"/>
-        </w:rPr>
+        <w:rPr/>
       </w:pPr>
       <w:hyperlink r:id="rId2">
         <w:r>
@@ -129,10 +120,12 @@
             <w:rFonts w:eastAsia="Lato Heavy" w:cs="Lato Heavy" w:ascii="Lato Black" w:hAnsi="Lato Black"/>
             <w:b/>
             <w:bCs/>
+            <w:strike w:val="false"/>
+            <w:dstrike w:val="false"/>
             <w:color w:val="1155CC"/>
             <w:sz w:val="20"/>
             <w:szCs w:val="20"/>
-            <w:u w:val="single" w:color="1155CC"/>
+            <w:u w:val="none"/>
           </w:rPr>
           <w:t>Personal Portfolio</w:t>
         </w:r>
@@ -142,9 +135,12 @@
           <w:rFonts w:eastAsia="Lato Heavy" w:cs="Lato Heavy" w:ascii="Lato Black" w:hAnsi="Lato Black"/>
           <w:b/>
           <w:bCs/>
+          <w:strike w:val="false"/>
+          <w:dstrike w:val="false"/>
           <w:color w:val="555555"/>
           <w:sz w:val="20"/>
           <w:szCs w:val="20"/>
+          <w:u w:val="none"/>
         </w:rPr>
         <w:t xml:space="preserve">   |   </w:t>
       </w:r>
@@ -155,10 +151,12 @@
             <w:rFonts w:eastAsia="Lato Heavy" w:cs="Lato Heavy" w:ascii="Lato Black" w:hAnsi="Lato Black"/>
             <w:b/>
             <w:bCs/>
+            <w:strike w:val="false"/>
+            <w:dstrike w:val="false"/>
             <w:color w:val="1155CC"/>
             <w:sz w:val="20"/>
             <w:szCs w:val="20"/>
-            <w:u w:val="single" w:color="1155CC"/>
+            <w:u w:val="none"/>
           </w:rPr>
           <w:t>GitHub Profile</w:t>
         </w:r>
@@ -168,9 +166,12 @@
           <w:rFonts w:eastAsia="Lato Heavy" w:cs="Lato Heavy" w:ascii="Lato Black" w:hAnsi="Lato Black"/>
           <w:b/>
           <w:bCs/>
+          <w:strike w:val="false"/>
+          <w:dstrike w:val="false"/>
           <w:color w:val="555555"/>
           <w:sz w:val="20"/>
           <w:szCs w:val="20"/>
+          <w:u w:val="none"/>
         </w:rPr>
         <w:t xml:space="preserve">   |   </w:t>
       </w:r>
@@ -181,10 +182,12 @@
             <w:rFonts w:eastAsia="Lato Heavy" w:cs="Lato Heavy" w:ascii="Lato Black" w:hAnsi="Lato Black"/>
             <w:b/>
             <w:bCs/>
+            <w:strike w:val="false"/>
+            <w:dstrike w:val="false"/>
             <w:color w:val="1155CC"/>
             <w:sz w:val="20"/>
             <w:szCs w:val="20"/>
-            <w:u w:val="single" w:color="1155CC"/>
+            <w:u w:val="none"/>
           </w:rPr>
           <w:t>LinkedIn Profile</w:t>
         </w:r>
@@ -427,7 +430,33 @@
           <w:sz w:val="18"/>
           <w:szCs w:val="18"/>
         </w:rPr>
-        <w:t xml:space="preserve">                                       </w:t>
+        <w:t xml:space="preserve">                                </w:t>
+      </w:r>
+      <w:r>
+        <w:rPr>
+          <w:rFonts w:eastAsia="Calibri (MS)" w:cs="Calibri (MS)" w:ascii="Lato Black" w:hAnsi="Lato Black"/>
+          <w:b/>
+          <w:bCs/>
+          <w:color w:val="222222"/>
+          <w:sz w:val="18"/>
+          <w:szCs w:val="18"/>
+          <w:u w:val="none"/>
+        </w:rPr>
+        <w:t xml:space="preserve">  </w:t>
+      </w:r>
+      <w:r>
+        <w:rPr>
+          <w:rFonts w:eastAsia="Calibri (MS)" w:cs="Calibri (MS)" w:ascii="Lato Black" w:hAnsi="Lato Black"/>
+          <w:b/>
+          <w:bCs/>
+          <w:strike w:val="false"/>
+          <w:dstrike w:val="false"/>
+          <w:color w:val="00A0FC"/>
+          <w:sz w:val="18"/>
+          <w:szCs w:val="18"/>
+          <w:u w:val="none"/>
+        </w:rPr>
+        <w:t xml:space="preserve"> </w:t>
       </w:r>
       <w:hyperlink r:id="rId5">
         <w:r>
@@ -436,10 +465,12 @@
             <w:rFonts w:eastAsia="Calibri (MS)" w:cs="Calibri (MS)" w:ascii="Lato Black" w:hAnsi="Lato Black"/>
             <w:b/>
             <w:bCs/>
-            <w:color w:val="1A62FF"/>
+            <w:strike w:val="false"/>
+            <w:dstrike w:val="false"/>
+            <w:color w:val="01B3FF"/>
             <w:sz w:val="18"/>
             <w:szCs w:val="18"/>
-            <w:u w:val="single" w:color="1A62FF"/>
+            <w:u w:val="none"/>
           </w:rPr>
           <w:t>[Live Demo]</w:t>
         </w:r>
@@ -449,9 +480,12 @@
           <w:rFonts w:eastAsia="Calibri (MS)" w:cs="Calibri (MS)" w:ascii="Lato Black" w:hAnsi="Lato Black"/>
           <w:b/>
           <w:bCs/>
-          <w:color w:val="000000"/>
-          <w:sz w:val="18"/>
-          <w:szCs w:val="18"/>
+          <w:strike w:val="false"/>
+          <w:dstrike w:val="false"/>
+          <w:color w:val="01B3FF"/>
+          <w:sz w:val="18"/>
+          <w:szCs w:val="18"/>
+          <w:u w:val="none"/>
         </w:rPr>
         <w:t xml:space="preserve"> </w:t>
       </w:r>
@@ -462,10 +496,12 @@
             <w:rFonts w:eastAsia="Calibri (MS)" w:cs="Calibri (MS)" w:ascii="Lato Black" w:hAnsi="Lato Black"/>
             <w:b/>
             <w:bCs/>
-            <w:color w:val="1A62FF"/>
+            <w:strike w:val="false"/>
+            <w:dstrike w:val="false"/>
+            <w:color w:val="01B3FF"/>
             <w:sz w:val="18"/>
             <w:szCs w:val="18"/>
-            <w:u w:val="single" w:color="1A62FF"/>
+            <w:u w:val="none"/>
           </w:rPr>
           <w:t>[GitHub]</w:t>
         </w:r>
@@ -475,10 +511,12 @@
           <w:rFonts w:eastAsia="Calibri (MS)" w:cs="Calibri (MS)" w:ascii="Lato Black" w:hAnsi="Lato Black"/>
           <w:b/>
           <w:bCs/>
-          <w:color w:val="1A62FF"/>
-          <w:sz w:val="18"/>
-          <w:szCs w:val="18"/>
-          <w:u w:val="single" w:color="1A62FF"/>
+          <w:strike w:val="false"/>
+          <w:dstrike w:val="false"/>
+          <w:color w:val="01B3FF"/>
+          <w:sz w:val="18"/>
+          <w:szCs w:val="18"/>
+          <w:u w:val="none"/>
         </w:rPr>
         <w:t xml:space="preserve"> </w:t>
       </w:r>
@@ -575,16 +613,17 @@
           <w:sz w:val="18"/>
           <w:szCs w:val="18"/>
         </w:rPr>
-        <w:t xml:space="preserve">                                                </w:t>
+        <w:t xml:space="preserve">                                            </w:t>
       </w:r>
       <w:r>
         <w:rPr>
           <w:rFonts w:eastAsia="Calibri (MS)" w:cs="Calibri (MS)" w:ascii="Lato Black" w:hAnsi="Lato Black"/>
-          <w:b/>
-          <w:bCs/>
-          <w:color w:val="222222"/>
-          <w:sz w:val="18"/>
-          <w:szCs w:val="18"/>
+          <w:strike w:val="false"/>
+          <w:dstrike w:val="false"/>
+          <w:color w:val="01B3FF"/>
+          <w:sz w:val="18"/>
+          <w:szCs w:val="18"/>
+          <w:u w:val="single"/>
         </w:rPr>
         <w:t xml:space="preserve"> </w:t>
       </w:r>
@@ -595,10 +634,12 @@
             <w:rFonts w:eastAsia="Calibri (MS)" w:cs="Calibri (MS)" w:ascii="Lato Black" w:hAnsi="Lato Black"/>
             <w:b/>
             <w:bCs/>
-            <w:color w:val="1A62FF"/>
+            <w:strike w:val="false"/>
+            <w:dstrike w:val="false"/>
+            <w:color w:val="01B3FF"/>
             <w:sz w:val="18"/>
             <w:szCs w:val="18"/>
-            <w:u w:val="single" w:color="1A62FF"/>
+            <w:u w:val="none"/>
           </w:rPr>
           <w:t>[Live</w:t>
         </w:r>
@@ -610,10 +651,12 @@
             <w:rFonts w:eastAsia="Calibri (MS)" w:cs="Calibri (MS)" w:ascii="Lato Black" w:hAnsi="Lato Black"/>
             <w:b/>
             <w:bCs/>
-            <w:color w:val="1A62FF"/>
+            <w:strike w:val="false"/>
+            <w:dstrike w:val="false"/>
+            <w:color w:val="01B3FF"/>
             <w:sz w:val="18"/>
             <w:szCs w:val="18"/>
-            <w:u w:val="single" w:color="1A62FF"/>
+            <w:u w:val="none"/>
           </w:rPr>
           <w:t xml:space="preserve"> </w:t>
         </w:r>
@@ -625,10 +668,12 @@
             <w:rFonts w:eastAsia="Calibri (MS)" w:cs="Calibri (MS)" w:ascii="Lato Black" w:hAnsi="Lato Black"/>
             <w:b/>
             <w:bCs/>
-            <w:color w:val="1A62FF"/>
+            <w:strike w:val="false"/>
+            <w:dstrike w:val="false"/>
+            <w:color w:val="01B3FF"/>
             <w:sz w:val="18"/>
             <w:szCs w:val="18"/>
-            <w:u w:val="single" w:color="1A62FF"/>
+            <w:u w:val="none"/>
           </w:rPr>
           <w:t>Demo]</w:t>
         </w:r>
@@ -638,9 +683,12 @@
           <w:rFonts w:eastAsia="Calibri (MS)" w:cs="Calibri (MS)" w:ascii="Lato Black" w:hAnsi="Lato Black"/>
           <w:b/>
           <w:bCs/>
-          <w:color w:val="000000"/>
-          <w:sz w:val="18"/>
-          <w:szCs w:val="18"/>
+          <w:strike w:val="false"/>
+          <w:dstrike w:val="false"/>
+          <w:color w:val="01B3FF"/>
+          <w:sz w:val="18"/>
+          <w:szCs w:val="18"/>
+          <w:u w:val="none"/>
         </w:rPr>
         <w:t xml:space="preserve"> </w:t>
       </w:r>
@@ -651,10 +699,12 @@
             <w:rFonts w:eastAsia="Calibri (MS)" w:cs="Calibri (MS)" w:ascii="Lato Black" w:hAnsi="Lato Black"/>
             <w:b/>
             <w:bCs/>
-            <w:color w:val="1A62FF"/>
+            <w:strike w:val="false"/>
+            <w:dstrike w:val="false"/>
+            <w:color w:val="01B3FF"/>
             <w:sz w:val="18"/>
             <w:szCs w:val="18"/>
-            <w:u w:val="single" w:color="1A62FF"/>
+            <w:u w:val="none"/>
           </w:rPr>
           <w:t>[GitHub]</w:t>
         </w:r>
@@ -664,10 +714,12 @@
           <w:rFonts w:eastAsia="Arimo" w:cs="Arimo" w:ascii="Lato Black" w:hAnsi="Lato Black"/>
           <w:b/>
           <w:bCs/>
-          <w:color w:val="1A62FF"/>
-          <w:sz w:val="18"/>
-          <w:szCs w:val="18"/>
-          <w:u w:val="single" w:color="1A62FF"/>
+          <w:strike w:val="false"/>
+          <w:dstrike w:val="false"/>
+          <w:color w:val="01B3FF"/>
+          <w:sz w:val="18"/>
+          <w:szCs w:val="18"/>
+          <w:u w:val="single"/>
         </w:rPr>
         <w:t xml:space="preserve"> </w:t>
       </w:r>
@@ -727,10 +779,6 @@
     <w:p>
       <w:pPr>
         <w:pStyle w:val="Normal"/>
-        <w:bidi w:val="0"/>
-        <w:spacing w:lineRule="auto" w:line="360" w:before="0" w:after="60"/>
-        <w:ind w:hanging="0" w:start="0"/>
-        <w:jc w:val="start"/>
         <w:rPr/>
       </w:pPr>
       <w:r>
@@ -749,24 +797,47 @@
           <w:sz w:val="18"/>
           <w:szCs w:val="18"/>
         </w:rPr>
-        <w:t xml:space="preserve">                                                      </w:t>
-      </w:r>
-      <w:r>
-        <w:rPr/>
+        <w:t xml:space="preserve">                                                 </w:t>
+      </w:r>
+      <w:r>
+        <w:rPr>
+          <w:rFonts w:eastAsia="Calibri (MS)" w:cs="Calibri (MS)" w:ascii="Lato Black" w:hAnsi="Lato Black"/>
+          <w:b/>
+          <w:bCs/>
+          <w:strike w:val="false"/>
+          <w:dstrike w:val="false"/>
+          <w:color w:val="222222"/>
+          <w:sz w:val="18"/>
+          <w:szCs w:val="18"/>
+        </w:rPr>
         <w:t xml:space="preserve"> </w:t>
       </w:r>
       <w:hyperlink r:id="rId11">
         <w:r>
           <w:rPr>
             <w:rStyle w:val="Style9"/>
-            <w:color w:val="1F3864"/>
+            <w:rFonts w:ascii="Lato Black" w:hAnsi="Lato Black"/>
+            <w:b/>
+            <w:bCs/>
+            <w:strike w:val="false"/>
+            <w:dstrike w:val="false"/>
+            <w:color w:val="01B3FF"/>
+            <w:sz w:val="18"/>
+            <w:szCs w:val="18"/>
           </w:rPr>
           <w:t>[Live Demo]</w:t>
         </w:r>
       </w:hyperlink>
       <w:r>
         <w:rPr>
-          <w:color w:val="1F3864"/>
+          <w:rFonts w:ascii="Lato Black" w:hAnsi="Lato Black"/>
+          <w:b/>
+          <w:bCs/>
+          <w:strike w:val="false"/>
+          <w:dstrike w:val="false"/>
+          <w:color w:val="01B3FF"/>
+          <w:sz w:val="18"/>
+          <w:szCs w:val="18"/>
         </w:rPr>
         <w:t xml:space="preserve"> </w:t>
       </w:r>
@@ -774,14 +845,28 @@
         <w:r>
           <w:rPr>
             <w:rStyle w:val="Style9"/>
-            <w:color w:val="1F3864"/>
+            <w:rFonts w:ascii="Lato Black" w:hAnsi="Lato Black"/>
+            <w:b/>
+            <w:bCs/>
+            <w:strike w:val="false"/>
+            <w:dstrike w:val="false"/>
+            <w:color w:val="01B3FF"/>
+            <w:sz w:val="18"/>
+            <w:szCs w:val="18"/>
           </w:rPr>
           <w:t>[GitHub]</w:t>
         </w:r>
       </w:hyperlink>
       <w:r>
         <w:rPr>
-          <w:color w:val="1F3864"/>
+          <w:rFonts w:ascii="Lato Black" w:hAnsi="Lato Black"/>
+          <w:b/>
+          <w:bCs/>
+          <w:strike w:val="false"/>
+          <w:dstrike w:val="false"/>
+          <w:color w:val="01B3FF"/>
+          <w:sz w:val="18"/>
+          <w:szCs w:val="18"/>
         </w:rPr>
         <w:t xml:space="preserve"> </w:t>
       </w:r>
@@ -854,19 +939,32 @@
           <w:sz w:val="18"/>
           <w:szCs w:val="18"/>
         </w:rPr>
-        <w:t xml:space="preserve">                                                                     </w:t>
-      </w:r>
-      <w:hyperlink r:id="rId13">
+        <w:t xml:space="preserve">                                                               </w:t>
+      </w:r>
+      <w:r>
+        <w:rPr>
+          <w:rFonts w:eastAsia="Calibri (MS)" w:cs="Calibri (MS)" w:ascii="Lato Black" w:hAnsi="Lato Black"/>
+          <w:strike w:val="false"/>
+          <w:dstrike w:val="false"/>
+          <w:color w:val="222222"/>
+          <w:sz w:val="18"/>
+          <w:szCs w:val="18"/>
+        </w:rPr>
+        <w:t xml:space="preserve"> </w:t>
+      </w:r>
+      <w:hyperlink r:id="rId13" w:tgtFrame="_blank">
         <w:r>
           <w:rPr>
-            <w:rStyle w:val="Style9"/>
+            <w:rStyle w:val="Hyperlink"/>
             <w:rFonts w:eastAsia="Calibri (MS)" w:cs="Calibri (MS)" w:ascii="Lato Black" w:hAnsi="Lato Black"/>
             <w:b/>
             <w:bCs/>
-            <w:color w:val="1A62FF"/>
+            <w:strike w:val="false"/>
+            <w:dstrike w:val="false"/>
+            <w:color w:val="01B3FF"/>
             <w:sz w:val="18"/>
             <w:szCs w:val="18"/>
-            <w:u w:val="single" w:color="1A62FF"/>
+            <w:u w:val="none"/>
           </w:rPr>
           <w:t>[Live Demo]</w:t>
         </w:r>
@@ -876,9 +974,12 @@
           <w:rFonts w:eastAsia="Calibri (MS)" w:cs="Calibri (MS)" w:ascii="Lato Black" w:hAnsi="Lato Black"/>
           <w:b/>
           <w:bCs/>
-          <w:color w:val="000000"/>
-          <w:sz w:val="18"/>
-          <w:szCs w:val="18"/>
+          <w:strike w:val="false"/>
+          <w:dstrike w:val="false"/>
+          <w:color w:val="01B3FF"/>
+          <w:sz w:val="18"/>
+          <w:szCs w:val="18"/>
+          <w:u w:val="none"/>
         </w:rPr>
         <w:t xml:space="preserve"> </w:t>
       </w:r>
@@ -889,10 +990,12 @@
             <w:rFonts w:eastAsia="Calibri (MS)" w:cs="Calibri (MS)" w:ascii="Lato Black" w:hAnsi="Lato Black"/>
             <w:b/>
             <w:bCs/>
-            <w:color w:val="1A62FF"/>
+            <w:strike w:val="false"/>
+            <w:dstrike w:val="false"/>
+            <w:color w:val="01B3FF"/>
             <w:sz w:val="18"/>
             <w:szCs w:val="18"/>
-            <w:u w:val="single" w:color="1A62FF"/>
+            <w:u w:val="none"/>
           </w:rPr>
           <w:t>[GitHub]</w:t>
         </w:r>
@@ -902,10 +1005,12 @@
           <w:rFonts w:eastAsia="Calibri (MS)" w:cs="Calibri (MS)" w:ascii="Lato Black" w:hAnsi="Lato Black"/>
           <w:b/>
           <w:bCs/>
-          <w:color w:val="1A62FF"/>
-          <w:sz w:val="18"/>
-          <w:szCs w:val="18"/>
-          <w:u w:val="single" w:color="1A62FF"/>
+          <w:strike w:val="false"/>
+          <w:dstrike w:val="false"/>
+          <w:color w:val="01B3FF"/>
+          <w:sz w:val="18"/>
+          <w:szCs w:val="18"/>
+          <w:u w:val="none"/>
         </w:rPr>
         <w:t xml:space="preserve"> </w:t>
       </w:r>
@@ -946,10 +1051,13 @@
       <w:pPr>
         <w:pStyle w:val="Normal"/>
         <w:bidi w:val="0"/>
-        <w:spacing w:lineRule="auto" w:line="360" w:before="0" w:after="30"/>
+        <w:spacing w:lineRule="auto" w:line="276" w:before="0" w:after="30"/>
         <w:ind w:hanging="0" w:start="0"/>
         <w:jc w:val="start"/>
-        <w:rPr/>
+        <w:rPr>
+          <w:sz w:val="18"/>
+          <w:szCs w:val="18"/>
+        </w:rPr>
       </w:pPr>
       <w:r>
         <w:rPr>
@@ -957,8 +1065,8 @@
           <w:b/>
           <w:bCs/>
           <w:color w:val="222222"/>
-          <w:sz w:val="16"/>
-          <w:szCs w:val="16"/>
+          <w:sz w:val="18"/>
+          <w:szCs w:val="18"/>
         </w:rPr>
         <w:t xml:space="preserve">Languages : </w:t>
       </w:r>
@@ -966,47 +1074,32 @@
         <w:rPr>
           <w:rFonts w:eastAsia="Calibri (MS)" w:cs="Calibri (MS)" w:ascii="Noto Sans Display SemiCondensed" w:hAnsi="Noto Sans Display SemiCondensed"/>
           <w:color w:val="222222"/>
-          <w:sz w:val="16"/>
-          <w:szCs w:val="16"/>
-        </w:rPr>
-        <w:t xml:space="preserve">JavaScript (ES6+), TypeScript, </w:t>
-      </w:r>
-      <w:r>
-        <w:rPr>
-          <w:rFonts w:eastAsia="Calibri (MS)" w:cs="Calibri (MS)" w:ascii="Noto Sans Display SemiCondensed" w:hAnsi="Noto Sans Display SemiCondensed"/>
-          <w:color w:val="222222"/>
-          <w:sz w:val="16"/>
-          <w:szCs w:val="16"/>
-        </w:rPr>
-        <w:t>Nodejs,</w:t>
-      </w:r>
-      <w:r>
-        <w:rPr>
-          <w:rFonts w:eastAsia="Calibri (MS)" w:cs="Calibri (MS)" w:ascii="Noto Sans Display SemiCondensed" w:hAnsi="Noto Sans Display SemiCondensed"/>
-          <w:color w:val="222222"/>
-          <w:sz w:val="16"/>
-          <w:szCs w:val="16"/>
-        </w:rPr>
-        <w:t xml:space="preserve"> Python, PHP, Bash</w:t>
+          <w:sz w:val="18"/>
+          <w:szCs w:val="18"/>
+        </w:rPr>
+        <w:t>JavaScript (ES6+), TypeScript, Nodejs, Python, PHP, Bash</w:t>
       </w:r>
       <w:r>
         <w:rPr>
           <w:rFonts w:eastAsia="Arimo" w:cs="Arimo" w:ascii="Noto Sans Display SemiCondensed" w:hAnsi="Noto Sans Display SemiCondensed"/>
           <w:color w:val="000000"/>
-          <w:sz w:val="16"/>
-          <w:szCs w:val="16"/>
-        </w:rPr>
-        <w:t xml:space="preserve"> </w:t>
-      </w:r>
-    </w:p>
-    <w:p>
-      <w:pPr>
-        <w:pStyle w:val="Normal"/>
-        <w:bidi w:val="0"/>
-        <w:spacing w:lineRule="auto" w:line="360" w:before="0" w:after="30"/>
+          <w:sz w:val="18"/>
+          <w:szCs w:val="18"/>
+        </w:rPr>
+        <w:t xml:space="preserve"> </w:t>
+      </w:r>
+    </w:p>
+    <w:p>
+      <w:pPr>
+        <w:pStyle w:val="Normal"/>
+        <w:bidi w:val="0"/>
+        <w:spacing w:lineRule="auto" w:line="276" w:before="0" w:after="30"/>
         <w:ind w:hanging="0" w:start="0"/>
         <w:jc w:val="start"/>
-        <w:rPr/>
+        <w:rPr>
+          <w:sz w:val="18"/>
+          <w:szCs w:val="18"/>
+        </w:rPr>
       </w:pPr>
       <w:r>
         <w:rPr>
@@ -1014,8 +1107,8 @@
           <w:b/>
           <w:bCs/>
           <w:color w:val="222222"/>
-          <w:sz w:val="16"/>
-          <w:szCs w:val="16"/>
+          <w:sz w:val="18"/>
+          <w:szCs w:val="18"/>
         </w:rPr>
         <w:t xml:space="preserve">Front-End : </w:t>
       </w:r>
@@ -1023,8 +1116,8 @@
         <w:rPr>
           <w:rFonts w:eastAsia="Calibri (MS)" w:cs="Calibri (MS)" w:ascii="Noto Sans Display SemiCondensed" w:hAnsi="Noto Sans Display SemiCondensed"/>
           <w:color w:val="222222"/>
-          <w:sz w:val="16"/>
-          <w:szCs w:val="16"/>
+          <w:sz w:val="18"/>
+          <w:szCs w:val="18"/>
         </w:rPr>
         <w:t xml:space="preserve">React, HTML5, CSS3, Bootstrap, Tailwind CSS </w:t>
       </w:r>
@@ -1033,10 +1126,13 @@
       <w:pPr>
         <w:pStyle w:val="Normal"/>
         <w:bidi w:val="0"/>
-        <w:spacing w:lineRule="auto" w:line="360" w:before="0" w:after="30"/>
+        <w:spacing w:lineRule="auto" w:line="276" w:before="0" w:after="30"/>
         <w:ind w:hanging="0" w:start="0"/>
         <w:jc w:val="start"/>
-        <w:rPr/>
+        <w:rPr>
+          <w:sz w:val="18"/>
+          <w:szCs w:val="18"/>
+        </w:rPr>
       </w:pPr>
       <w:r>
         <w:rPr>
@@ -1044,8 +1140,8 @@
           <w:b/>
           <w:bCs/>
           <w:color w:val="222222"/>
-          <w:sz w:val="16"/>
-          <w:szCs w:val="16"/>
+          <w:sz w:val="18"/>
+          <w:szCs w:val="18"/>
         </w:rPr>
         <w:t>Back-End :</w:t>
       </w:r>
@@ -1055,8 +1151,8 @@
           <w:b/>
           <w:bCs/>
           <w:color w:val="222222"/>
-          <w:sz w:val="16"/>
-          <w:szCs w:val="16"/>
+          <w:sz w:val="18"/>
+          <w:szCs w:val="18"/>
         </w:rPr>
         <w:t xml:space="preserve"> </w:t>
       </w:r>
@@ -1064,8 +1160,8 @@
         <w:rPr>
           <w:rFonts w:eastAsia="Calibri (MS)" w:cs="Calibri (MS)" w:ascii="Noto Sans Display SemiCondensed" w:hAnsi="Noto Sans Display SemiCondensed"/>
           <w:color w:val="222222"/>
-          <w:sz w:val="16"/>
-          <w:szCs w:val="16"/>
+          <w:sz w:val="18"/>
+          <w:szCs w:val="18"/>
         </w:rPr>
         <w:t>Node.js, Express.js, PHP, Python, Flask, FastAPI, REST APIs, JWT Auth</w:t>
       </w:r>
@@ -1073,20 +1169,23 @@
         <w:rPr>
           <w:rFonts w:eastAsia="Arimo" w:cs="Arimo" w:ascii="Noto Sans Display SemiCondensed" w:hAnsi="Noto Sans Display SemiCondensed"/>
           <w:color w:val="000000"/>
-          <w:sz w:val="16"/>
-          <w:szCs w:val="16"/>
-        </w:rPr>
-        <w:t xml:space="preserve"> </w:t>
-      </w:r>
-    </w:p>
-    <w:p>
-      <w:pPr>
-        <w:pStyle w:val="Normal"/>
-        <w:bidi w:val="0"/>
-        <w:spacing w:lineRule="auto" w:line="360" w:before="0" w:after="30"/>
+          <w:sz w:val="18"/>
+          <w:szCs w:val="18"/>
+        </w:rPr>
+        <w:t xml:space="preserve"> </w:t>
+      </w:r>
+    </w:p>
+    <w:p>
+      <w:pPr>
+        <w:pStyle w:val="Normal"/>
+        <w:bidi w:val="0"/>
+        <w:spacing w:lineRule="auto" w:line="276" w:before="0" w:after="30"/>
         <w:ind w:hanging="0" w:start="0"/>
         <w:jc w:val="start"/>
-        <w:rPr/>
+        <w:rPr>
+          <w:sz w:val="18"/>
+          <w:szCs w:val="18"/>
+        </w:rPr>
       </w:pPr>
       <w:r>
         <w:rPr>
@@ -1094,8 +1193,8 @@
           <w:b/>
           <w:bCs/>
           <w:color w:val="222222"/>
-          <w:sz w:val="16"/>
-          <w:szCs w:val="16"/>
+          <w:sz w:val="18"/>
+          <w:szCs w:val="18"/>
         </w:rPr>
         <w:t xml:space="preserve">Databases / Storage : </w:t>
       </w:r>
@@ -1103,8 +1202,8 @@
         <w:rPr>
           <w:rFonts w:eastAsia="Calibri (MS)" w:cs="Calibri (MS)" w:ascii="Noto Sans Display SemiCondensed" w:hAnsi="Noto Sans Display SemiCondensed"/>
           <w:color w:val="222222"/>
-          <w:sz w:val="16"/>
-          <w:szCs w:val="16"/>
+          <w:sz w:val="18"/>
+          <w:szCs w:val="18"/>
         </w:rPr>
         <w:t xml:space="preserve">MongoDB, MySQL, JSON, XML </w:t>
       </w:r>
@@ -1113,10 +1212,13 @@
       <w:pPr>
         <w:pStyle w:val="Normal"/>
         <w:bidi w:val="0"/>
-        <w:spacing w:lineRule="auto" w:line="360" w:before="0" w:after="135"/>
+        <w:spacing w:lineRule="auto" w:line="276" w:before="0" w:after="135"/>
         <w:ind w:hanging="0" w:start="0"/>
         <w:jc w:val="start"/>
-        <w:rPr/>
+        <w:rPr>
+          <w:sz w:val="18"/>
+          <w:szCs w:val="18"/>
+        </w:rPr>
       </w:pPr>
       <w:r>
         <w:rPr>
@@ -1124,8 +1226,8 @@
           <w:b/>
           <w:bCs/>
           <w:color w:val="222222"/>
-          <w:sz w:val="16"/>
-          <w:szCs w:val="16"/>
+          <w:sz w:val="18"/>
+          <w:szCs w:val="18"/>
         </w:rPr>
         <w:t>Deployment &amp; Tools :</w:t>
       </w:r>
@@ -1133,8 +1235,8 @@
         <w:rPr>
           <w:rFonts w:eastAsia="Calibri (MS)" w:cs="Calibri (MS)" w:ascii="Lato Black" w:hAnsi="Lato Black"/>
           <w:color w:val="222222"/>
-          <w:sz w:val="16"/>
-          <w:szCs w:val="16"/>
+          <w:sz w:val="18"/>
+          <w:szCs w:val="18"/>
         </w:rPr>
         <w:t xml:space="preserve"> </w:t>
       </w:r>
@@ -1142,8 +1244,8 @@
         <w:rPr>
           <w:rFonts w:eastAsia="Calibri (MS)" w:cs="Calibri (MS)" w:ascii="Noto Sans Display SemiCondensed" w:hAnsi="Noto Sans Display SemiCondensed"/>
           <w:color w:val="222222"/>
-          <w:sz w:val="16"/>
-          <w:szCs w:val="16"/>
+          <w:sz w:val="18"/>
+          <w:szCs w:val="18"/>
         </w:rPr>
         <w:t>Git, GitHub, CI/CD, Linux, Vercel, Netlify, Render</w:t>
       </w:r>
@@ -1168,18 +1270,7 @@
           <w:sz w:val="19"/>
           <w:szCs w:val="19"/>
         </w:rPr>
-        <w:t xml:space="preserve">WORK </w:t>
-      </w:r>
-      <w:r>
-        <w:rPr>
-          <w:rFonts w:eastAsia="Calibri (MS) Bold" w:cs="Calibri (MS) Bold" w:ascii="Lato Black" w:hAnsi="Lato Black"/>
-          <w:b/>
-          <w:bCs/>
-          <w:color w:val="1155CC"/>
-          <w:sz w:val="19"/>
-          <w:szCs w:val="19"/>
-        </w:rPr>
-        <w:t>EXPERIENCE</w:t>
+        <w:t>WORK EXPERIENCE</w:t>
       </w:r>
       <w:r>
         <w:rPr>
@@ -1261,19 +1352,19 @@
         <w:bidi w:val="0"/>
         <w:spacing w:lineRule="auto" w:line="276" w:before="0" w:after="135"/>
         <w:ind w:hanging="89" w:start="89" w:end="0"/>
-        <w:jc w:val="start"/>
+        <w:jc w:val="both"/>
         <w:rPr/>
       </w:pPr>
       <w:r>
         <w:rPr>
-          <w:rFonts w:eastAsia="Calibri (MS)" w:cs="Calibri (MS)" w:ascii="Carlito" w:hAnsi="Carlito"/>
+          <w:rFonts w:eastAsia="Calibri (MS)" w:cs="Calibri (MS)" w:ascii="Noto Sans Display SemiCondensed" w:hAnsi="Noto Sans Display SemiCondensed"/>
           <w:b w:val="false"/>
           <w:bCs w:val="false"/>
           <w:color w:val="222222"/>
           <w:sz w:val="18"/>
           <w:szCs w:val="18"/>
         </w:rPr>
-        <w:t>Built and deployed full-stack web applications end-to-end — from backend architecture and REST API development (Node.js, Express, FastAPI) to database design with MongoDB and MySQL — for domestic and international clients.</w:t>
+        <w:t>Built and deployed full-stack web applications end-to-end — from backend architecture and REST API development (Node.js, Express, FastAPI) to      database design with MongoDB and MySQL — for domestic and international clients.</w:t>
       </w:r>
     </w:p>
     <w:p>
@@ -1288,12 +1379,12 @@
         <w:bidi w:val="0"/>
         <w:spacing w:lineRule="auto" w:line="276" w:before="0" w:after="135"/>
         <w:ind w:hanging="89" w:start="89" w:end="0"/>
-        <w:jc w:val="start"/>
+        <w:jc w:val="both"/>
         <w:rPr/>
       </w:pPr>
       <w:r>
         <w:rPr>
-          <w:rFonts w:eastAsia="Calibri (MS)" w:cs="Calibri (MS)" w:ascii="Carlito" w:hAnsi="Carlito"/>
+          <w:rFonts w:eastAsia="Calibri (MS)" w:cs="Calibri (MS)" w:ascii="Noto Sans Display SemiCondensed" w:hAnsi="Noto Sans Display SemiCondensed"/>
           <w:color w:val="222222"/>
           <w:sz w:val="18"/>
           <w:szCs w:val="18"/>
@@ -1313,17 +1404,17 @@
         <w:bidi w:val="0"/>
         <w:spacing w:lineRule="auto" w:line="276" w:before="0" w:after="135"/>
         <w:ind w:hanging="89" w:start="89" w:end="0"/>
-        <w:jc w:val="start"/>
+        <w:jc w:val="both"/>
         <w:rPr/>
       </w:pPr>
       <w:r>
         <w:rPr>
-          <w:rFonts w:eastAsia="Calibri (MS)" w:cs="Calibri (MS)" w:ascii="Carlito" w:hAnsi="Carlito"/>
-          <w:color w:val="222222"/>
-          <w:sz w:val="18"/>
-          <w:szCs w:val="18"/>
-        </w:rPr>
-        <w:t>Managed complete deployment pipelines using Git/GitHub, Vercel, Netlify, and Render, along with real-time features via WebSockets and secure JWT-based authentication.</w:t>
+          <w:rFonts w:eastAsia="Calibri (MS)" w:cs="Calibri (MS)" w:ascii="Noto Sans Display SemiCondensed" w:hAnsi="Noto Sans Display SemiCondensed"/>
+          <w:color w:val="222222"/>
+          <w:sz w:val="18"/>
+          <w:szCs w:val="18"/>
+        </w:rPr>
+        <w:t>Managed complete deployment pipelines using Git/GitHub, Vercel, Netlify, and Render, along with real-time features via WebSockets and secure JWT-   based authentication.</w:t>
       </w:r>
     </w:p>
     <w:p>
@@ -1417,33 +1508,7 @@
           <w:sz w:val="18"/>
           <w:szCs w:val="18"/>
         </w:rPr>
-        <w:t xml:space="preserve"> </w:t>
-      </w:r>
-      <w:r>
-        <w:rPr>
-          <w:rFonts w:eastAsia="Calibri (MS) Bold Italics" w:cs="Calibri (MS) Bold Italics" w:ascii="Lato Black" w:hAnsi="Lato Black"/>
-          <w:b/>
-          <w:bCs/>
-          <w:i/>
-          <w:iCs/>
-          <w:color w:val="555555"/>
-          <w:sz w:val="18"/>
-          <w:szCs w:val="18"/>
-        </w:rPr>
-        <w:t xml:space="preserve"> </w:t>
-      </w:r>
-      <w:r>
-        <w:rPr>
-          <w:rFonts w:eastAsia="Calibri (MS) Bold Italics" w:cs="Calibri (MS) Bold Italics" w:ascii="Lato Black" w:hAnsi="Lato Black"/>
-          <w:b/>
-          <w:bCs/>
-          <w:i/>
-          <w:iCs/>
-          <w:color w:val="555555"/>
-          <w:sz w:val="18"/>
-          <w:szCs w:val="18"/>
-        </w:rPr>
-        <w:t xml:space="preserve">|  </w:t>
+        <w:t xml:space="preserve">  |  </w:t>
       </w:r>
       <w:r>
         <w:rPr>
@@ -1456,121 +1521,56 @@
           <w:sz w:val="18"/>
           <w:szCs w:val="18"/>
         </w:rPr>
-        <w:t>G</w:t>
+        <w:t>GPA – 3.61</w:t>
+      </w:r>
+    </w:p>
+    <w:p>
+      <w:pPr>
+        <w:pStyle w:val="Normal"/>
+        <w:bidi w:val="0"/>
+        <w:spacing w:lineRule="auto" w:line="360" w:before="0" w:after="15"/>
+        <w:ind w:hanging="0" w:start="0"/>
+        <w:jc w:val="start"/>
+        <w:rPr>
+          <w:rFonts w:ascii="Lato Black" w:hAnsi="Lato Black"/>
+        </w:rPr>
+      </w:pPr>
+      <w:r>
+        <w:rPr>
+          <w:rFonts w:eastAsia="Calibri (MS) Bold" w:cs="Calibri (MS) Bold" w:ascii="Lato Black" w:hAnsi="Lato Black"/>
+          <w:b/>
+          <w:bCs/>
+          <w:color w:val="222222"/>
+          <w:sz w:val="18"/>
+          <w:szCs w:val="18"/>
+        </w:rPr>
+        <w:t>Higher Secondary Certificate (HSC BM), Business Studies</w:t>
+      </w:r>
+      <w:r>
+        <w:rPr>
+          <w:rFonts w:eastAsia="Calibri (MS) Italics" w:cs="Calibri (MS) Italics" w:ascii="Lato Black" w:hAnsi="Lato Black"/>
+          <w:i/>
+          <w:iCs/>
+          <w:color w:val="555555"/>
+          <w:sz w:val="18"/>
+          <w:szCs w:val="18"/>
+        </w:rPr>
+        <w:t xml:space="preserve">  — </w:t>
+      </w:r>
+      <w:r>
+        <w:rPr>
+          <w:rFonts w:eastAsia="Calibri (MS) Italics" w:cs="Calibri (MS) Italics" w:ascii="Noto Sans Display SemiCondensed" w:hAnsi="Noto Sans Display SemiCondensed"/>
+          <w:i/>
+          <w:iCs/>
+          <w:color w:val="555555"/>
+          <w:sz w:val="18"/>
+          <w:szCs w:val="18"/>
+        </w:rPr>
+        <w:t xml:space="preserve"> Komolganj Govt. College, </w:t>
       </w:r>
       <w:r>
         <w:rPr>
           <w:rFonts w:eastAsia="Calibri (MS) Bold Italics" w:cs="Calibri (MS) Bold Italics" w:ascii="Noto Sans Display SemiCondensed" w:hAnsi="Noto Sans Display SemiCondensed"/>
-          <w:b w:val="false"/>
-          <w:bCs w:val="false"/>
-          <w:i/>
-          <w:iCs/>
-          <w:color w:val="555555"/>
-          <w:sz w:val="18"/>
-          <w:szCs w:val="18"/>
-        </w:rPr>
-        <w:t>P</w:t>
-      </w:r>
-      <w:r>
-        <w:rPr>
-          <w:rFonts w:eastAsia="Calibri (MS) Bold Italics" w:cs="Calibri (MS) Bold Italics" w:ascii="Noto Sans Display SemiCondensed" w:hAnsi="Noto Sans Display SemiCondensed"/>
-          <w:b w:val="false"/>
-          <w:bCs w:val="false"/>
-          <w:i/>
-          <w:iCs/>
-          <w:color w:val="555555"/>
-          <w:sz w:val="18"/>
-          <w:szCs w:val="18"/>
-        </w:rPr>
-        <w:t xml:space="preserve">A – </w:t>
-      </w:r>
-      <w:r>
-        <w:rPr>
-          <w:rFonts w:eastAsia="Calibri (MS) Bold Italics" w:cs="Calibri (MS) Bold Italics" w:ascii="Noto Sans Display SemiCondensed" w:hAnsi="Noto Sans Display SemiCondensed"/>
-          <w:b w:val="false"/>
-          <w:bCs w:val="false"/>
-          <w:i/>
-          <w:iCs/>
-          <w:color w:val="555555"/>
-          <w:sz w:val="18"/>
-          <w:szCs w:val="18"/>
-        </w:rPr>
-        <w:t>3.</w:t>
-      </w:r>
-      <w:r>
-        <w:rPr>
-          <w:rFonts w:eastAsia="Calibri (MS) Bold Italics" w:cs="Calibri (MS) Bold Italics" w:ascii="Noto Sans Display SemiCondensed" w:hAnsi="Noto Sans Display SemiCondensed"/>
-          <w:b w:val="false"/>
-          <w:bCs w:val="false"/>
-          <w:i/>
-          <w:iCs/>
-          <w:color w:val="555555"/>
-          <w:sz w:val="18"/>
-          <w:szCs w:val="18"/>
-        </w:rPr>
-        <w:t>6</w:t>
-      </w:r>
-      <w:r>
-        <w:rPr>
-          <w:rFonts w:eastAsia="Calibri (MS) Bold Italics" w:cs="Calibri (MS) Bold Italics" w:ascii="Noto Sans Display SemiCondensed" w:hAnsi="Noto Sans Display SemiCondensed"/>
-          <w:b w:val="false"/>
-          <w:bCs w:val="false"/>
-          <w:i/>
-          <w:iCs/>
-          <w:color w:val="555555"/>
-          <w:sz w:val="18"/>
-          <w:szCs w:val="18"/>
-        </w:rPr>
-        <w:t>1</w:t>
-      </w:r>
-    </w:p>
-    <w:p>
-      <w:pPr>
-        <w:pStyle w:val="Normal"/>
-        <w:bidi w:val="0"/>
-        <w:spacing w:lineRule="auto" w:line="360" w:before="0" w:after="15"/>
-        <w:ind w:hanging="0" w:start="0"/>
-        <w:jc w:val="start"/>
-        <w:rPr>
-          <w:rFonts w:ascii="Lato Black" w:hAnsi="Lato Black"/>
-        </w:rPr>
-      </w:pPr>
-      <w:r>
-        <w:rPr>
-          <w:rFonts w:eastAsia="Calibri (MS) Bold" w:cs="Calibri (MS) Bold" w:ascii="Lato Black" w:hAnsi="Lato Black"/>
-          <w:b/>
-          <w:bCs/>
-          <w:color w:val="222222"/>
-          <w:sz w:val="18"/>
-          <w:szCs w:val="18"/>
-        </w:rPr>
-        <w:t>Higher Secondary Certificate (HSC BM), Business Studies</w:t>
-      </w:r>
-      <w:r>
-        <w:rPr>
-          <w:rFonts w:eastAsia="Calibri (MS) Italics" w:cs="Calibri (MS) Italics" w:ascii="Lato Black" w:hAnsi="Lato Black"/>
-          <w:i/>
-          <w:iCs/>
-          <w:color w:val="555555"/>
-          <w:sz w:val="18"/>
-          <w:szCs w:val="18"/>
-        </w:rPr>
-        <w:t xml:space="preserve">  — </w:t>
-      </w:r>
-      <w:r>
-        <w:rPr>
-          <w:rFonts w:eastAsia="Calibri (MS) Italics" w:cs="Calibri (MS) Italics" w:ascii="Noto Sans Display SemiCondensed" w:hAnsi="Noto Sans Display SemiCondensed"/>
-          <w:i/>
-          <w:iCs/>
-          <w:color w:val="555555"/>
-          <w:sz w:val="18"/>
-          <w:szCs w:val="18"/>
-        </w:rPr>
-        <w:t xml:space="preserve"> Komolganj Govt. College, </w:t>
-      </w:r>
-      <w:r>
-        <w:rPr>
-          <w:rFonts w:eastAsia="Calibri (MS) Bold Italics" w:cs="Calibri (MS) Bold Italics" w:ascii="Noto Sans Display SemiCondensed" w:hAnsi="Noto Sans Display SemiCondensed"/>
           <w:b/>
           <w:bCs/>
           <w:i/>
@@ -1590,18 +1590,7 @@
           <w:sz w:val="18"/>
           <w:szCs w:val="18"/>
         </w:rPr>
-        <w:t xml:space="preserve">  </w:t>
-      </w:r>
-      <w:r>
-        <w:rPr>
-          <w:rFonts w:eastAsia="Arimo Bold" w:cs="Arimo Bold" w:ascii="Lato Black" w:hAnsi="Lato Black"/>
-          <w:b/>
-          <w:bCs/>
-          <w:color w:val="000000"/>
-          <w:sz w:val="18"/>
-          <w:szCs w:val="18"/>
-        </w:rPr>
-        <w:t xml:space="preserve">|  </w:t>
+        <w:t xml:space="preserve">  |  </w:t>
       </w:r>
       <w:r>
         <w:rPr>
@@ -1641,7 +1630,7 @@
       </w:r>
       <w:r>
         <w:rPr>
-          <w:rFonts w:eastAsia="Calibri (MS) Italics" w:cs="Calibri (MS) Italics" w:ascii="Carlito" w:hAnsi="Carlito"/>
+          <w:rFonts w:eastAsia="Calibri (MS) Italics" w:cs="Calibri (MS) Italics" w:ascii="Noto Sans Display SemiCondensed" w:hAnsi="Noto Sans Display SemiCondensed"/>
           <w:i/>
           <w:iCs/>
           <w:color w:val="222222"/>
@@ -1652,7 +1641,7 @@
       </w:r>
       <w:r>
         <w:rPr>
-          <w:rFonts w:eastAsia="Calibri (MS) Italics" w:cs="Calibri (MS) Italics" w:ascii="Carlito" w:hAnsi="Carlito"/>
+          <w:rFonts w:eastAsia="Calibri (MS) Italics" w:cs="Calibri (MS) Italics" w:ascii="Noto Sans Display SemiCondensed" w:hAnsi="Noto Sans Display SemiCondensed"/>
           <w:b/>
           <w:bCs/>
           <w:i/>
@@ -1665,7 +1654,7 @@
       </w:r>
       <w:r>
         <w:rPr>
-          <w:rFonts w:eastAsia="Calibri (MS) Italics" w:cs="Calibri (MS) Italics" w:ascii="Carlito" w:hAnsi="Carlito"/>
+          <w:rFonts w:eastAsia="Calibri (MS) Italics" w:cs="Calibri (MS) Italics" w:ascii="Noto Sans Display SemiCondensed" w:hAnsi="Noto Sans Display SemiCondensed"/>
           <w:i/>
           <w:iCs/>
           <w:color w:val="222222"/>
@@ -1676,7 +1665,7 @@
       </w:r>
       <w:r>
         <w:rPr>
-          <w:rFonts w:eastAsia="Calibri (MS) Italics" w:cs="Calibri (MS) Italics" w:ascii="Carlito" w:hAnsi="Carlito"/>
+          <w:rFonts w:eastAsia="Calibri (MS) Italics" w:cs="Calibri (MS) Italics" w:ascii="Noto Sans Display SemiCondensed" w:hAnsi="Noto Sans Display SemiCondensed"/>
           <w:b/>
           <w:bCs/>
           <w:i/>
@@ -1689,7 +1678,7 @@
       </w:r>
       <w:r>
         <w:rPr>
-          <w:rFonts w:eastAsia="Calibri (MS) Italics" w:cs="Calibri (MS) Italics" w:ascii="Carlito" w:hAnsi="Carlito"/>
+          <w:rFonts w:eastAsia="Calibri (MS) Italics" w:cs="Calibri (MS) Italics" w:ascii="Noto Sans Display SemiCondensed" w:hAnsi="Noto Sans Display SemiCondensed"/>
           <w:i/>
           <w:iCs/>
           <w:color w:val="222222"/>
@@ -1744,51 +1733,7 @@
           <w:sz w:val="18"/>
           <w:szCs w:val="18"/>
         </w:rPr>
-        <w:t xml:space="preserve">English (Professional working proficiency)     </w:t>
-      </w:r>
-      <w:r>
-        <w:rPr>
-          <w:rFonts w:eastAsia="Calibri (MS)" w:cs="Calibri (MS)" w:ascii="Carlito" w:hAnsi="Carlito"/>
-          <w:b/>
-          <w:bCs/>
-          <w:color w:val="222222"/>
-          <w:sz w:val="18"/>
-          <w:szCs w:val="18"/>
-        </w:rPr>
-        <w:t xml:space="preserve">|     </w:t>
-      </w:r>
-      <w:r>
-        <w:rPr>
-          <w:rFonts w:eastAsia="Calibri (MS)" w:cs="Calibri (MS)" w:ascii="Carlito" w:hAnsi="Carlito"/>
-          <w:b/>
-          <w:bCs/>
-          <w:color w:val="222222"/>
-          <w:sz w:val="18"/>
-          <w:szCs w:val="18"/>
-        </w:rPr>
-        <w:t xml:space="preserve">Bangla (Native)     </w:t>
-      </w:r>
-      <w:r>
-        <w:rPr>
-          <w:rFonts w:eastAsia="Calibri (MS)" w:cs="Calibri (MS)" w:ascii="Carlito" w:hAnsi="Carlito"/>
-          <w:b/>
-          <w:bCs/>
-          <w:color w:val="222222"/>
-          <w:sz w:val="18"/>
-          <w:szCs w:val="18"/>
-        </w:rPr>
-        <w:t xml:space="preserve">|    </w:t>
-      </w:r>
-      <w:r>
-        <w:rPr>
-          <w:rFonts w:eastAsia="Calibri (MS)" w:cs="Calibri (MS)" w:ascii="Carlito" w:hAnsi="Carlito"/>
-          <w:b/>
-          <w:bCs/>
-          <w:color w:val="222222"/>
-          <w:sz w:val="18"/>
-          <w:szCs w:val="18"/>
-        </w:rPr>
-        <w:t xml:space="preserve"> Hindi (Conversational)</w:t>
+        <w:t>English (Professional working proficiency)     |     Bangla (Native)     |     Hindi (Conversational)</w:t>
       </w:r>
       <w:r>
         <w:rPr>
@@ -1822,7 +1767,7 @@
       <w:start w:val="1"/>
       <w:numFmt w:val="bullet"/>
       <w:suff w:val="space"/>
-      <w:lvlText w:val=""/>
+      <w:lvlText w:val=""/>
       <w:lvlJc w:val="start"/>
       <w:pPr>
         <w:tabs>
@@ -1831,11 +1776,7 @@
         <w:ind w:start="1440" w:hanging="1296"/>
       </w:pPr>
       <w:rPr>
-        <w:rFonts w:ascii="Monotype Sorts" w:hAnsi="Monotype Sorts" w:cs="Monotype Sorts" w:hint="default"/>
-        <w:position w:val="0"/>
-        <w:sz w:val="18"/>
-        <w:szCs w:val="18"/>
-        <w:vertAlign w:val="baseline"/>
+        <w:rFonts w:ascii="MT Extra" w:hAnsi="MT Extra" w:cs="MT Extra" w:hint="default"/>
       </w:rPr>
     </w:lvl>
     <w:lvl w:ilvl="1">
@@ -2144,7 +2085,8 @@
       <w:widowControl w:val="false"/>
       <w:suppressAutoHyphens w:val="true"/>
       <w:bidi w:val="0"/>
-      <w:spacing w:before="0" w:after="0"/>
+      <w:spacing w:lineRule="auto" w:line="360" w:before="0" w:after="60"/>
+      <w:ind w:hanging="0" w:start="0"/>
       <w:jc w:val="start"/>
     </w:pPr>
     <w:rPr>
@@ -2178,6 +2120,13 @@
     <w:name w:val="Numbering Symbols"/>
     <w:qFormat/>
     <w:rPr/>
+  </w:style>
+  <w:style w:type="character" w:styleId="Bullets">
+    <w:name w:val="Bullets"/>
+    <w:qFormat/>
+    <w:rPr>
+      <w:rFonts w:ascii="OpenSymbol" w:hAnsi="OpenSymbol" w:eastAsia="OpenSymbol" w:cs="OpenSymbol"/>
+    </w:rPr>
   </w:style>
   <w:style w:type="paragraph" w:styleId="Heading">
     <w:name w:val="Heading"/>

</xml_diff>